<commit_message>
arreglos de base de datos, diagramas y documento DEA
</commit_message>
<xml_diff>
--- a/docs/Documentación/DEA Formato_Documento_de_Arquitectura.docx
+++ b/docs/Documentación/DEA Formato_Documento_de_Arquitectura.docx
@@ -181,12 +181,12 @@
                 <wp:inline distB="0" distT="0" distL="0" distR="0">
                   <wp:extent cx="687115" cy="696277"/>
                   <wp:effectExtent b="0" l="0" r="0" t="0"/>
-                  <wp:docPr id="34" name="image16.jpg"/>
+                  <wp:docPr id="34" name="image3.jpg"/>
                   <a:graphic>
                     <a:graphicData uri="http://schemas.openxmlformats.org/drawingml/2006/picture">
                       <pic:pic>
                         <pic:nvPicPr>
-                          <pic:cNvPr id="0" name="image16.jpg"/>
+                          <pic:cNvPr id="0" name="image3.jpg"/>
                           <pic:cNvPicPr preferRelativeResize="0"/>
                         </pic:nvPicPr>
                         <pic:blipFill>
@@ -1333,12 +1333,12 @@
                 <wp:extent cx="3896995" cy="37465"/>
                 <wp:effectExtent b="0" l="0" r="0" t="0"/>
                 <wp:wrapTopAndBottom distB="0" distT="0"/>
-                <wp:docPr id="1" name="image11.png"/>
+                <wp:docPr id="1" name="image15.png"/>
                 <a:graphic>
                   <a:graphicData uri="http://schemas.openxmlformats.org/drawingml/2006/picture">
                     <pic:pic>
                       <pic:nvPicPr>
-                        <pic:cNvPr id="0" name="image11.png"/>
+                        <pic:cNvPr id="0" name="image15.png"/>
                         <pic:cNvPicPr preferRelativeResize="0"/>
                       </pic:nvPicPr>
                       <pic:blipFill>
@@ -2583,14 +2583,11 @@
               <w:ind w:left="20" w:right="52" w:firstLine="0"/>
               <w:jc w:val="center"/>
               <w:rPr>
-                <w:rFonts w:ascii="Arial" w:cs="Arial" w:eastAsia="Arial" w:hAnsi="Arial"/>
-                <w:b w:val="0"/>
-                <w:bCs w:val="0"/>
+                <w:rFonts w:ascii="Times New Roman" w:cs="Times New Roman" w:eastAsia="Times New Roman" w:hAnsi="Times New Roman"/>
                 <w:i w:val="0"/>
                 <w:iCs w:val="0"/>
                 <w:smallCaps w:val="0"/>
                 <w:strike w:val="0"/>
-                <w:color w:val="000000"/>
                 <w:sz w:val="24"/>
                 <w:szCs w:val="24"/>
                 <w:u w:val="none"/>
@@ -2600,14 +2597,11 @@
             </w:pPr>
             <w:r>
               <w:rPr>
-                <w:rFonts w:ascii="Arial" w:cs="Arial" w:eastAsia="Arial" w:hAnsi="Arial"/>
-                <w:b w:val="0"/>
-                <w:bCs w:val="0"/>
+                <w:rFonts w:ascii="Times New Roman" w:cs="Times New Roman" w:eastAsia="Times New Roman" w:hAnsi="Times New Roman"/>
                 <w:i w:val="0"/>
                 <w:iCs w:val="0"/>
                 <w:smallCaps w:val="0"/>
                 <w:strike w:val="0"/>
-                <w:color w:val="538dd3"/>
                 <w:sz w:val="24"/>
                 <w:szCs w:val="24"/>
                 <w:u w:val="none"/>
@@ -2615,7 +2609,16 @@
                 <w:vertAlign w:val="baseline"/>
                 <w:rtl w:val="0"/>
               </w:rPr>
-              <w:t xml:space="preserve">03/10/2024</w:t>
+              <w:t xml:space="preserve">03/09/202</w:t>
+            </w:r>
+            <w:r>
+              <w:rPr>
+                <w:rFonts w:ascii="Times New Roman" w:cs="Times New Roman" w:eastAsia="Times New Roman" w:hAnsi="Times New Roman"/>
+                <w:sz w:val="24"/>
+                <w:szCs w:val="24"/>
+                <w:rtl w:val="0"/>
+              </w:rPr>
+              <w:t xml:space="preserve">5</w:t>
             </w:r>
             <w:r>
               <w:rPr>
@@ -2650,14 +2653,11 @@
               <w:ind w:left="28" w:right="1" w:firstLine="0"/>
               <w:jc w:val="center"/>
               <w:rPr>
-                <w:rFonts w:ascii="Arial" w:cs="Arial" w:eastAsia="Arial" w:hAnsi="Arial"/>
-                <w:b w:val="0"/>
-                <w:bCs w:val="0"/>
+                <w:rFonts w:ascii="Times New Roman" w:cs="Times New Roman" w:eastAsia="Times New Roman" w:hAnsi="Times New Roman"/>
                 <w:i w:val="0"/>
                 <w:iCs w:val="0"/>
                 <w:smallCaps w:val="0"/>
                 <w:strike w:val="0"/>
-                <w:color w:val="000000"/>
                 <w:sz w:val="24"/>
                 <w:szCs w:val="24"/>
                 <w:u w:val="none"/>
@@ -2667,14 +2667,11 @@
             </w:pPr>
             <w:r>
               <w:rPr>
-                <w:rFonts w:ascii="Arial" w:cs="Arial" w:eastAsia="Arial" w:hAnsi="Arial"/>
-                <w:b w:val="0"/>
-                <w:bCs w:val="0"/>
+                <w:rFonts w:ascii="Times New Roman" w:cs="Times New Roman" w:eastAsia="Times New Roman" w:hAnsi="Times New Roman"/>
                 <w:i w:val="0"/>
                 <w:iCs w:val="0"/>
                 <w:smallCaps w:val="0"/>
                 <w:strike w:val="0"/>
-                <w:color w:val="538dd3"/>
                 <w:sz w:val="24"/>
                 <w:szCs w:val="24"/>
                 <w:u w:val="none"/>
@@ -2725,13 +2722,22 @@
                 <w:smallCaps w:val="0"/>
                 <w:strike w:val="0"/>
                 <w:color w:val="000000"/>
-                <w:sz w:val="18"/>
-                <w:szCs w:val="18"/>
+                <w:sz w:val="24"/>
+                <w:szCs w:val="24"/>
                 <w:u w:val="none"/>
                 <w:shd w:fill="auto" w:val="clear"/>
                 <w:vertAlign w:val="baseline"/>
               </w:rPr>
             </w:pPr>
+            <w:r>
+              <w:rPr>
+                <w:rFonts w:ascii="Times New Roman" w:cs="Times New Roman" w:eastAsia="Times New Roman" w:hAnsi="Times New Roman"/>
+                <w:sz w:val="24"/>
+                <w:szCs w:val="24"/>
+                <w:rtl w:val="0"/>
+              </w:rPr>
+              <w:t xml:space="preserve">Juan,Kevin,David,Kirmy</w:t>
+            </w:r>
             <w:r>
               <w:rPr>
                 <w:rtl w:val="0"/>
@@ -2773,13 +2779,22 @@
                 <w:smallCaps w:val="0"/>
                 <w:strike w:val="0"/>
                 <w:color w:val="000000"/>
-                <w:sz w:val="18"/>
-                <w:szCs w:val="18"/>
+                <w:sz w:val="24"/>
+                <w:szCs w:val="24"/>
                 <w:u w:val="none"/>
                 <w:shd w:fill="auto" w:val="clear"/>
                 <w:vertAlign w:val="baseline"/>
               </w:rPr>
             </w:pPr>
+            <w:r>
+              <w:rPr>
+                <w:rFonts w:ascii="Times New Roman" w:cs="Times New Roman" w:eastAsia="Times New Roman" w:hAnsi="Times New Roman"/>
+                <w:sz w:val="24"/>
+                <w:szCs w:val="24"/>
+                <w:rtl w:val="0"/>
+              </w:rPr>
+              <w:t xml:space="preserve">Vision Del Proyecto SW</w:t>
+            </w:r>
             <w:r>
               <w:rPr>
                 <w:rtl w:val="0"/>
@@ -2820,8 +2835,8 @@
                 <w:smallCaps w:val="0"/>
                 <w:strike w:val="0"/>
                 <w:color w:val="000000"/>
-                <w:sz w:val="18"/>
-                <w:szCs w:val="18"/>
+                <w:sz w:val="24"/>
+                <w:szCs w:val="24"/>
                 <w:u w:val="none"/>
                 <w:shd w:fill="auto" w:val="clear"/>
                 <w:vertAlign w:val="baseline"/>
@@ -2829,8 +2844,417 @@
             </w:pPr>
             <w:r>
               <w:rPr>
+                <w:rFonts w:ascii="Times New Roman" w:cs="Times New Roman" w:eastAsia="Times New Roman" w:hAnsi="Times New Roman"/>
+                <w:sz w:val="24"/>
+                <w:szCs w:val="24"/>
                 <w:rtl w:val="0"/>
               </w:rPr>
+              <w:t xml:space="preserve">Instructor</w:t>
+            </w:r>
+            <w:r>
+              <w:rPr>
+                <w:rtl w:val="0"/>
+              </w:rPr>
+            </w:r>
+          </w:p>
+        </w:tc>
+      </w:tr>
+      <w:tr>
+        <w:trPr>
+          <w:cantSplit w:val="0"/>
+          <w:trHeight w:val="592" w:hRule="atLeast"/>
+          <w:tblHeader w:val="0"/>
+        </w:trPr>
+        <w:tc>
+          <w:tcPr>
+            <w:tcBorders>
+              <w:top w:color="000000" w:space="0" w:sz="6" w:val="single"/>
+              <w:right w:color="000000" w:space="0" w:sz="6" w:val="single"/>
+            </w:tcBorders>
+          </w:tcPr>
+          <w:p>
+            <w:pPr>
+              <w:spacing w:line="275" w:lineRule="auto"/>
+              <w:ind w:left="20" w:right="52" w:firstLine="0"/>
+              <w:jc w:val="center"/>
+              <w:rPr>
+                <w:rFonts w:ascii="Times New Roman" w:cs="Times New Roman" w:eastAsia="Times New Roman" w:hAnsi="Times New Roman"/>
+                <w:i w:val="0"/>
+                <w:iCs w:val="0"/>
+                <w:smallCaps w:val="0"/>
+                <w:strike w:val="0"/>
+                <w:sz w:val="24"/>
+                <w:szCs w:val="24"/>
+                <w:u w:val="none"/>
+                <w:shd w:fill="auto" w:val="clear"/>
+                <w:vertAlign w:val="baseline"/>
+              </w:rPr>
+            </w:pPr>
+            <w:r>
+              <w:rPr>
+                <w:rFonts w:ascii="Times New Roman" w:cs="Times New Roman" w:eastAsia="Times New Roman" w:hAnsi="Times New Roman"/>
+                <w:sz w:val="24"/>
+                <w:szCs w:val="24"/>
+                <w:rtl w:val="0"/>
+              </w:rPr>
+              <w:t xml:space="preserve">06/12/2025</w:t>
+            </w:r>
+            <w:r>
+              <w:rPr>
+                <w:rtl w:val="0"/>
+              </w:rPr>
+            </w:r>
+          </w:p>
+        </w:tc>
+        <w:tc>
+          <w:tcPr>
+            <w:tcBorders>
+              <w:top w:color="000000" w:space="0" w:sz="6" w:val="single"/>
+              <w:left w:color="000000" w:space="0" w:sz="6" w:val="single"/>
+              <w:right w:color="000000" w:space="0" w:sz="6" w:val="single"/>
+            </w:tcBorders>
+          </w:tcPr>
+          <w:p>
+            <w:pPr>
+              <w:keepNext w:val="0"/>
+              <w:keepLines w:val="0"/>
+              <w:pageBreakBefore w:val="0"/>
+              <w:widowControl w:val="0"/>
+              <w:pBdr>
+                <w:top w:space="0" w:sz="0" w:val="nil"/>
+                <w:left w:space="0" w:sz="0" w:val="nil"/>
+                <w:bottom w:space="0" w:sz="0" w:val="nil"/>
+                <w:right w:space="0" w:sz="0" w:val="nil"/>
+                <w:between w:space="0" w:sz="0" w:val="nil"/>
+              </w:pBdr>
+              <w:shd w:fill="auto" w:val="clear"/>
+              <w:spacing w:after="0" w:before="0" w:line="275" w:lineRule="auto"/>
+              <w:ind w:left="28" w:right="1" w:firstLine="0"/>
+              <w:jc w:val="center"/>
+              <w:rPr>
+                <w:rFonts w:ascii="Times New Roman" w:cs="Times New Roman" w:eastAsia="Times New Roman" w:hAnsi="Times New Roman"/>
+                <w:i w:val="0"/>
+                <w:iCs w:val="0"/>
+                <w:smallCaps w:val="0"/>
+                <w:strike w:val="0"/>
+                <w:sz w:val="24"/>
+                <w:szCs w:val="24"/>
+                <w:u w:val="none"/>
+                <w:shd w:fill="auto" w:val="clear"/>
+                <w:vertAlign w:val="baseline"/>
+              </w:rPr>
+            </w:pPr>
+            <w:r>
+              <w:rPr>
+                <w:rFonts w:ascii="Times New Roman" w:cs="Times New Roman" w:eastAsia="Times New Roman" w:hAnsi="Times New Roman"/>
+                <w:sz w:val="24"/>
+                <w:szCs w:val="24"/>
+                <w:rtl w:val="0"/>
+              </w:rPr>
+              <w:t xml:space="preserve">2.0</w:t>
+            </w:r>
+            <w:r>
+              <w:rPr>
+                <w:rtl w:val="0"/>
+              </w:rPr>
+            </w:r>
+          </w:p>
+        </w:tc>
+        <w:tc>
+          <w:tcPr>
+            <w:tcBorders>
+              <w:top w:color="000000" w:space="0" w:sz="6" w:val="single"/>
+              <w:left w:color="000000" w:space="0" w:sz="6" w:val="single"/>
+              <w:right w:color="000000" w:space="0" w:sz="6" w:val="single"/>
+            </w:tcBorders>
+          </w:tcPr>
+          <w:p>
+            <w:pPr>
+              <w:rPr>
+                <w:rFonts w:ascii="Times New Roman" w:cs="Times New Roman" w:eastAsia="Times New Roman" w:hAnsi="Times New Roman"/>
+                <w:sz w:val="24"/>
+                <w:szCs w:val="24"/>
+              </w:rPr>
+            </w:pPr>
+            <w:r>
+              <w:rPr>
+                <w:rFonts w:ascii="Times New Roman" w:cs="Times New Roman" w:eastAsia="Times New Roman" w:hAnsi="Times New Roman"/>
+                <w:sz w:val="24"/>
+                <w:szCs w:val="24"/>
+                <w:rtl w:val="0"/>
+              </w:rPr>
+              <w:t xml:space="preserve">Juan,Kevin,David,Kirmy</w:t>
+            </w:r>
+          </w:p>
+        </w:tc>
+        <w:tc>
+          <w:tcPr>
+            <w:tcBorders>
+              <w:top w:color="000000" w:space="0" w:sz="6" w:val="single"/>
+              <w:left w:color="000000" w:space="0" w:sz="6" w:val="single"/>
+              <w:right w:color="000000" w:space="0" w:sz="6" w:val="single"/>
+            </w:tcBorders>
+          </w:tcPr>
+          <w:p>
+            <w:pPr>
+              <w:keepNext w:val="0"/>
+              <w:keepLines w:val="0"/>
+              <w:pageBreakBefore w:val="0"/>
+              <w:widowControl w:val="0"/>
+              <w:pBdr>
+                <w:top w:space="0" w:sz="0" w:val="nil"/>
+                <w:left w:space="0" w:sz="0" w:val="nil"/>
+                <w:bottom w:space="0" w:sz="0" w:val="nil"/>
+                <w:right w:space="0" w:sz="0" w:val="nil"/>
+                <w:between w:space="0" w:sz="0" w:val="nil"/>
+              </w:pBdr>
+              <w:shd w:fill="auto" w:val="clear"/>
+              <w:spacing w:after="0" w:before="0" w:line="240" w:lineRule="auto"/>
+              <w:ind w:left="0" w:right="0" w:firstLine="0"/>
+              <w:jc w:val="left"/>
+              <w:rPr>
+                <w:rFonts w:ascii="Times New Roman" w:cs="Times New Roman" w:eastAsia="Times New Roman" w:hAnsi="Times New Roman"/>
+                <w:sz w:val="24"/>
+                <w:szCs w:val="24"/>
+              </w:rPr>
+            </w:pPr>
+            <w:r>
+              <w:rPr>
+                <w:rFonts w:ascii="Times New Roman" w:cs="Times New Roman" w:eastAsia="Times New Roman" w:hAnsi="Times New Roman"/>
+                <w:sz w:val="24"/>
+                <w:szCs w:val="24"/>
+                <w:rtl w:val="0"/>
+              </w:rPr>
+              <w:t xml:space="preserve">Informe Analisis y diseño SW</w:t>
+            </w:r>
+          </w:p>
+        </w:tc>
+        <w:tc>
+          <w:tcPr>
+            <w:tcBorders>
+              <w:top w:color="000000" w:space="0" w:sz="6" w:val="single"/>
+              <w:left w:color="000000" w:space="0" w:sz="6" w:val="single"/>
+            </w:tcBorders>
+          </w:tcPr>
+          <w:p>
+            <w:pPr>
+              <w:keepNext w:val="0"/>
+              <w:keepLines w:val="0"/>
+              <w:pageBreakBefore w:val="0"/>
+              <w:widowControl w:val="0"/>
+              <w:pBdr>
+                <w:top w:space="0" w:sz="0" w:val="nil"/>
+                <w:left w:space="0" w:sz="0" w:val="nil"/>
+                <w:bottom w:space="0" w:sz="0" w:val="nil"/>
+                <w:right w:space="0" w:sz="0" w:val="nil"/>
+                <w:between w:space="0" w:sz="0" w:val="nil"/>
+              </w:pBdr>
+              <w:shd w:fill="auto" w:val="clear"/>
+              <w:spacing w:after="0" w:before="0" w:line="240" w:lineRule="auto"/>
+              <w:ind w:left="0" w:right="0" w:firstLine="0"/>
+              <w:jc w:val="left"/>
+              <w:rPr>
+                <w:rFonts w:ascii="Times New Roman" w:cs="Times New Roman" w:eastAsia="Times New Roman" w:hAnsi="Times New Roman"/>
+                <w:sz w:val="24"/>
+                <w:szCs w:val="24"/>
+              </w:rPr>
+            </w:pPr>
+            <w:r>
+              <w:rPr>
+                <w:rFonts w:ascii="Times New Roman" w:cs="Times New Roman" w:eastAsia="Times New Roman" w:hAnsi="Times New Roman"/>
+                <w:sz w:val="24"/>
+                <w:szCs w:val="24"/>
+                <w:rtl w:val="0"/>
+              </w:rPr>
+              <w:t xml:space="preserve">Instructor</w:t>
+            </w:r>
+          </w:p>
+        </w:tc>
+      </w:tr>
+      <w:tr>
+        <w:trPr>
+          <w:cantSplit w:val="0"/>
+          <w:trHeight w:val="592" w:hRule="atLeast"/>
+          <w:tblHeader w:val="0"/>
+        </w:trPr>
+        <w:tc>
+          <w:tcPr>
+            <w:tcBorders>
+              <w:top w:color="000000" w:space="0" w:sz="6" w:val="single"/>
+              <w:right w:color="000000" w:space="0" w:sz="6" w:val="single"/>
+            </w:tcBorders>
+          </w:tcPr>
+          <w:p>
+            <w:pPr>
+              <w:spacing w:line="275" w:lineRule="auto"/>
+              <w:ind w:left="20" w:right="52" w:firstLine="0"/>
+              <w:jc w:val="center"/>
+              <w:rPr>
+                <w:rFonts w:ascii="Times New Roman" w:cs="Times New Roman" w:eastAsia="Times New Roman" w:hAnsi="Times New Roman"/>
+                <w:sz w:val="24"/>
+                <w:szCs w:val="24"/>
+              </w:rPr>
+            </w:pPr>
+            <w:r>
+              <w:rPr>
+                <w:rFonts w:ascii="Times New Roman" w:cs="Times New Roman" w:eastAsia="Times New Roman" w:hAnsi="Times New Roman"/>
+                <w:sz w:val="24"/>
+                <w:szCs w:val="24"/>
+                <w:rtl w:val="0"/>
+              </w:rPr>
+              <w:t xml:space="preserve">10/04/2026</w:t>
+            </w:r>
+          </w:p>
+        </w:tc>
+        <w:tc>
+          <w:tcPr>
+            <w:tcBorders>
+              <w:top w:color="000000" w:space="0" w:sz="6" w:val="single"/>
+              <w:left w:color="000000" w:space="0" w:sz="6" w:val="single"/>
+              <w:right w:color="000000" w:space="0" w:sz="6" w:val="single"/>
+            </w:tcBorders>
+          </w:tcPr>
+          <w:p>
+            <w:pPr>
+              <w:keepNext w:val="0"/>
+              <w:keepLines w:val="0"/>
+              <w:pageBreakBefore w:val="0"/>
+              <w:widowControl w:val="0"/>
+              <w:pBdr>
+                <w:top w:space="0" w:sz="0" w:val="nil"/>
+                <w:left w:space="0" w:sz="0" w:val="nil"/>
+                <w:bottom w:space="0" w:sz="0" w:val="nil"/>
+                <w:right w:space="0" w:sz="0" w:val="nil"/>
+                <w:between w:space="0" w:sz="0" w:val="nil"/>
+              </w:pBdr>
+              <w:shd w:fill="auto" w:val="clear"/>
+              <w:spacing w:after="0" w:before="0" w:line="275" w:lineRule="auto"/>
+              <w:ind w:left="28" w:right="1" w:firstLine="0"/>
+              <w:jc w:val="center"/>
+              <w:rPr>
+                <w:rFonts w:ascii="Times New Roman" w:cs="Times New Roman" w:eastAsia="Times New Roman" w:hAnsi="Times New Roman"/>
+                <w:sz w:val="24"/>
+                <w:szCs w:val="24"/>
+              </w:rPr>
+            </w:pPr>
+            <w:r>
+              <w:rPr>
+                <w:rFonts w:ascii="Times New Roman" w:cs="Times New Roman" w:eastAsia="Times New Roman" w:hAnsi="Times New Roman"/>
+                <w:sz w:val="24"/>
+                <w:szCs w:val="24"/>
+                <w:rtl w:val="0"/>
+              </w:rPr>
+              <w:t xml:space="preserve">3.0</w:t>
+            </w:r>
+          </w:p>
+        </w:tc>
+        <w:tc>
+          <w:tcPr>
+            <w:tcBorders>
+              <w:top w:color="000000" w:space="0" w:sz="6" w:val="single"/>
+              <w:left w:color="000000" w:space="0" w:sz="6" w:val="single"/>
+              <w:right w:color="000000" w:space="0" w:sz="6" w:val="single"/>
+            </w:tcBorders>
+          </w:tcPr>
+          <w:p>
+            <w:pPr>
+              <w:rPr>
+                <w:rFonts w:ascii="Times New Roman" w:cs="Times New Roman" w:eastAsia="Times New Roman" w:hAnsi="Times New Roman"/>
+                <w:sz w:val="24"/>
+                <w:szCs w:val="24"/>
+              </w:rPr>
+            </w:pPr>
+            <w:r>
+              <w:rPr>
+                <w:rFonts w:ascii="Times New Roman" w:cs="Times New Roman" w:eastAsia="Times New Roman" w:hAnsi="Times New Roman"/>
+                <w:sz w:val="24"/>
+                <w:szCs w:val="24"/>
+                <w:rtl w:val="0"/>
+              </w:rPr>
+              <w:t xml:space="preserve">Juan,Kevin,David,Kirmy</w:t>
+            </w:r>
+          </w:p>
+        </w:tc>
+        <w:tc>
+          <w:tcPr>
+            <w:tcBorders>
+              <w:top w:color="000000" w:space="0" w:sz="6" w:val="single"/>
+              <w:left w:color="000000" w:space="0" w:sz="6" w:val="single"/>
+              <w:right w:color="000000" w:space="0" w:sz="6" w:val="single"/>
+            </w:tcBorders>
+          </w:tcPr>
+          <w:p>
+            <w:pPr>
+              <w:keepNext w:val="0"/>
+              <w:keepLines w:val="0"/>
+              <w:pageBreakBefore w:val="0"/>
+              <w:widowControl w:val="0"/>
+              <w:pBdr>
+                <w:top w:space="0" w:sz="0" w:val="nil"/>
+                <w:left w:space="0" w:sz="0" w:val="nil"/>
+                <w:bottom w:space="0" w:sz="0" w:val="nil"/>
+                <w:right w:space="0" w:sz="0" w:val="nil"/>
+                <w:between w:space="0" w:sz="0" w:val="nil"/>
+              </w:pBdr>
+              <w:shd w:fill="auto" w:val="clear"/>
+              <w:spacing w:after="0" w:before="0" w:line="240" w:lineRule="auto"/>
+              <w:ind w:left="0" w:right="0" w:firstLine="0"/>
+              <w:jc w:val="left"/>
+              <w:rPr>
+                <w:rFonts w:ascii="Times New Roman" w:cs="Times New Roman" w:eastAsia="Times New Roman" w:hAnsi="Times New Roman"/>
+                <w:sz w:val="24"/>
+                <w:szCs w:val="24"/>
+              </w:rPr>
+            </w:pPr>
+            <w:r>
+              <w:rPr>
+                <w:rFonts w:ascii="Times New Roman" w:cs="Times New Roman" w:eastAsia="Times New Roman" w:hAnsi="Times New Roman"/>
+                <w:sz w:val="24"/>
+                <w:szCs w:val="24"/>
+                <w:rtl w:val="0"/>
+              </w:rPr>
+              <w:t xml:space="preserve">Documento especificacion arquitectura DEA</w:t>
+            </w:r>
+          </w:p>
+        </w:tc>
+        <w:tc>
+          <w:tcPr>
+            <w:tcBorders>
+              <w:top w:color="000000" w:space="0" w:sz="6" w:val="single"/>
+              <w:left w:color="000000" w:space="0" w:sz="6" w:val="single"/>
+            </w:tcBorders>
+          </w:tcPr>
+          <w:p>
+            <w:pPr>
+              <w:keepNext w:val="0"/>
+              <w:keepLines w:val="0"/>
+              <w:pageBreakBefore w:val="0"/>
+              <w:widowControl w:val="0"/>
+              <w:pBdr>
+                <w:top w:space="0" w:sz="0" w:val="nil"/>
+                <w:left w:space="0" w:sz="0" w:val="nil"/>
+                <w:bottom w:space="0" w:sz="0" w:val="nil"/>
+                <w:right w:space="0" w:sz="0" w:val="nil"/>
+                <w:between w:space="0" w:sz="0" w:val="nil"/>
+              </w:pBdr>
+              <w:shd w:fill="auto" w:val="clear"/>
+              <w:spacing w:after="0" w:before="0" w:line="240" w:lineRule="auto"/>
+              <w:ind w:left="0" w:right="0" w:firstLine="0"/>
+              <w:jc w:val="left"/>
+              <w:rPr>
+                <w:rFonts w:ascii="Times New Roman" w:cs="Times New Roman" w:eastAsia="Times New Roman" w:hAnsi="Times New Roman"/>
+                <w:sz w:val="24"/>
+                <w:szCs w:val="24"/>
+              </w:rPr>
+            </w:pPr>
+            <w:r>
+              <w:rPr>
+                <w:rFonts w:ascii="Times New Roman" w:cs="Times New Roman" w:eastAsia="Times New Roman" w:hAnsi="Times New Roman"/>
+                <w:sz w:val="24"/>
+                <w:szCs w:val="24"/>
+                <w:rtl w:val="0"/>
+              </w:rPr>
+              <w:t xml:space="preserve">Instructor</w:t>
             </w:r>
           </w:p>
         </w:tc>
@@ -11336,12 +11760,12 @@
           <wp:inline distB="114300" distT="114300" distL="114300" distR="114300">
             <wp:extent cx="6478420" cy="3721100"/>
             <wp:effectExtent b="0" l="0" r="0" t="0"/>
-            <wp:docPr id="22" name="image14.png"/>
+            <wp:docPr id="22" name="image23.png"/>
             <a:graphic>
               <a:graphicData uri="http://schemas.openxmlformats.org/drawingml/2006/picture">
                 <pic:pic>
                   <pic:nvPicPr>
-                    <pic:cNvPr id="0" name="image14.png"/>
+                    <pic:cNvPr id="0" name="image23.png"/>
                     <pic:cNvPicPr preferRelativeResize="0"/>
                   </pic:nvPicPr>
                   <pic:blipFill>
@@ -11792,12 +12216,12 @@
           <wp:inline distB="114300" distT="114300" distL="114300" distR="114300">
             <wp:extent cx="6478420" cy="3695700"/>
             <wp:effectExtent b="0" l="0" r="0" t="0"/>
-            <wp:docPr id="13" name="image17.png"/>
+            <wp:docPr id="13" name="image24.png"/>
             <a:graphic>
               <a:graphicData uri="http://schemas.openxmlformats.org/drawingml/2006/picture">
                 <pic:pic>
                   <pic:nvPicPr>
-                    <pic:cNvPr id="0" name="image17.png"/>
+                    <pic:cNvPr id="0" name="image24.png"/>
                     <pic:cNvPicPr preferRelativeResize="0"/>
                   </pic:nvPicPr>
                   <pic:blipFill>
@@ -12077,12 +12501,12 @@
           <wp:inline distB="114300" distT="114300" distL="114300" distR="114300">
             <wp:extent cx="6478420" cy="4000500"/>
             <wp:effectExtent b="0" l="0" r="0" t="0"/>
-            <wp:docPr id="9" name="image22.png"/>
+            <wp:docPr id="9" name="image12.png"/>
             <a:graphic>
               <a:graphicData uri="http://schemas.openxmlformats.org/drawingml/2006/picture">
                 <pic:pic>
                   <pic:nvPicPr>
-                    <pic:cNvPr id="0" name="image22.png"/>
+                    <pic:cNvPr id="0" name="image12.png"/>
                     <pic:cNvPicPr preferRelativeResize="0"/>
                   </pic:nvPicPr>
                   <pic:blipFill>
@@ -13116,12 +13540,12 @@
           <wp:inline distB="114300" distT="114300" distL="114300" distR="114300">
             <wp:extent cx="6478420" cy="4762500"/>
             <wp:effectExtent b="0" l="0" r="0" t="0"/>
-            <wp:docPr id="17" name="image15.png"/>
+            <wp:docPr id="17" name="image19.png"/>
             <a:graphic>
               <a:graphicData uri="http://schemas.openxmlformats.org/drawingml/2006/picture">
                 <pic:pic>
                   <pic:nvPicPr>
-                    <pic:cNvPr id="0" name="image15.png"/>
+                    <pic:cNvPr id="0" name="image19.png"/>
                     <pic:cNvPicPr preferRelativeResize="0"/>
                   </pic:nvPicPr>
                   <pic:blipFill>
@@ -13502,12 +13926,12 @@
           <wp:inline distB="114300" distT="114300" distL="114300" distR="114300">
             <wp:extent cx="3916590" cy="2902222"/>
             <wp:effectExtent b="0" l="0" r="0" t="0"/>
-            <wp:docPr id="11" name="image9.jpg"/>
+            <wp:docPr id="11" name="image5.jpg"/>
             <a:graphic>
               <a:graphicData uri="http://schemas.openxmlformats.org/drawingml/2006/picture">
                 <pic:pic>
                   <pic:nvPicPr>
-                    <pic:cNvPr id="0" name="image9.jpg"/>
+                    <pic:cNvPr id="0" name="image5.jpg"/>
                     <pic:cNvPicPr preferRelativeResize="0"/>
                   </pic:nvPicPr>
                   <pic:blipFill>
@@ -13715,12 +14139,12 @@
           <wp:inline distB="114300" distT="114300" distL="114300" distR="114300">
             <wp:extent cx="5387658" cy="4358554"/>
             <wp:effectExtent b="0" l="0" r="0" t="0"/>
-            <wp:docPr id="26" name="image12.png"/>
+            <wp:docPr id="26" name="image17.png"/>
             <a:graphic>
               <a:graphicData uri="http://schemas.openxmlformats.org/drawingml/2006/picture">
                 <pic:pic>
                   <pic:nvPicPr>
-                    <pic:cNvPr id="0" name="image12.png"/>
+                    <pic:cNvPr id="0" name="image17.png"/>
                     <pic:cNvPicPr preferRelativeResize="0"/>
                   </pic:nvPicPr>
                   <pic:blipFill>
@@ -13964,12 +14388,12 @@
           <wp:inline distB="114300" distT="114300" distL="114300" distR="114300">
             <wp:extent cx="3222639" cy="4664347"/>
             <wp:effectExtent b="0" l="0" r="0" t="0"/>
-            <wp:docPr id="32" name="image20.png"/>
+            <wp:docPr id="32" name="image27.png"/>
             <a:graphic>
               <a:graphicData uri="http://schemas.openxmlformats.org/drawingml/2006/picture">
                 <pic:pic>
                   <pic:nvPicPr>
-                    <pic:cNvPr id="0" name="image20.png"/>
+                    <pic:cNvPr id="0" name="image27.png"/>
                     <pic:cNvPicPr preferRelativeResize="0"/>
                   </pic:nvPicPr>
                   <pic:blipFill>
@@ -14182,12 +14606,12 @@
           <wp:inline distB="114300" distT="114300" distL="114300" distR="114300">
             <wp:extent cx="1967127" cy="3702322"/>
             <wp:effectExtent b="0" l="0" r="0" t="0"/>
-            <wp:docPr id="33" name="image18.png"/>
+            <wp:docPr id="33" name="image28.png"/>
             <a:graphic>
               <a:graphicData uri="http://schemas.openxmlformats.org/drawingml/2006/picture">
                 <pic:pic>
                   <pic:nvPicPr>
-                    <pic:cNvPr id="0" name="image18.png"/>
+                    <pic:cNvPr id="0" name="image28.png"/>
                     <pic:cNvPicPr preferRelativeResize="0"/>
                   </pic:nvPicPr>
                   <pic:blipFill>
@@ -14340,12 +14764,12 @@
           <wp:inline distB="114300" distT="114300" distL="114300" distR="114300">
             <wp:extent cx="3273108" cy="3831024"/>
             <wp:effectExtent b="0" l="0" r="0" t="0"/>
-            <wp:docPr id="18" name="image1.png"/>
+            <wp:docPr id="18" name="image2.png"/>
             <a:graphic>
               <a:graphicData uri="http://schemas.openxmlformats.org/drawingml/2006/picture">
                 <pic:pic>
                   <pic:nvPicPr>
-                    <pic:cNvPr id="0" name="image1.png"/>
+                    <pic:cNvPr id="0" name="image2.png"/>
                     <pic:cNvPicPr preferRelativeResize="0"/>
                   </pic:nvPicPr>
                   <pic:blipFill>
@@ -14613,12 +15037,12 @@
           <wp:inline distB="114300" distT="114300" distL="114300" distR="114300">
             <wp:extent cx="7290760" cy="5156200"/>
             <wp:effectExtent b="0" l="0" r="0" t="0"/>
-            <wp:docPr id="16" name="image6.png"/>
+            <wp:docPr id="16" name="image4.png"/>
             <a:graphic>
               <a:graphicData uri="http://schemas.openxmlformats.org/drawingml/2006/picture">
                 <pic:pic>
                   <pic:nvPicPr>
-                    <pic:cNvPr id="0" name="image6.png"/>
+                    <pic:cNvPr id="0" name="image4.png"/>
                     <pic:cNvPicPr preferRelativeResize="0"/>
                   </pic:nvPicPr>
                   <pic:blipFill>
@@ -15051,12 +15475,12 @@
           <wp:inline distB="114300" distT="114300" distL="114300" distR="114300">
             <wp:extent cx="7290760" cy="5156200"/>
             <wp:effectExtent b="0" l="0" r="0" t="0"/>
-            <wp:docPr id="28" name="image23.jpg"/>
+            <wp:docPr id="28" name="image16.jpg"/>
             <a:graphic>
               <a:graphicData uri="http://schemas.openxmlformats.org/drawingml/2006/picture">
                 <pic:pic>
                   <pic:nvPicPr>
-                    <pic:cNvPr id="0" name="image23.jpg"/>
+                    <pic:cNvPr id="0" name="image16.jpg"/>
                     <pic:cNvPicPr preferRelativeResize="0"/>
                   </pic:nvPicPr>
                   <pic:blipFill>
@@ -15358,12 +15782,12 @@
           <wp:inline distB="114300" distT="114300" distL="114300" distR="114300">
             <wp:extent cx="5527820" cy="6616972"/>
             <wp:effectExtent b="0" l="0" r="0" t="0"/>
-            <wp:docPr id="12" name="image21.png"/>
+            <wp:docPr id="12" name="image11.png"/>
             <a:graphic>
               <a:graphicData uri="http://schemas.openxmlformats.org/drawingml/2006/picture">
                 <pic:pic>
                   <pic:nvPicPr>
-                    <pic:cNvPr id="0" name="image21.png"/>
+                    <pic:cNvPr id="0" name="image11.png"/>
                     <pic:cNvPicPr preferRelativeResize="0"/>
                   </pic:nvPicPr>
                   <pic:blipFill>
@@ -16001,12 +16425,12 @@
           <wp:inline distB="114300" distT="114300" distL="114300" distR="114300">
             <wp:extent cx="7214362" cy="4703356"/>
             <wp:effectExtent b="0" l="0" r="0" t="0"/>
-            <wp:docPr id="25" name="image19.png"/>
+            <wp:docPr id="25" name="image13.png"/>
             <a:graphic>
               <a:graphicData uri="http://schemas.openxmlformats.org/drawingml/2006/picture">
                 <pic:pic>
                   <pic:nvPicPr>
-                    <pic:cNvPr id="0" name="image19.png"/>
+                    <pic:cNvPr id="0" name="image13.png"/>
                     <pic:cNvPicPr preferRelativeResize="0"/>
                   </pic:nvPicPr>
                   <pic:blipFill>
@@ -16270,12 +16694,12 @@
           <wp:inline distB="114300" distT="114300" distL="114300" distR="114300">
             <wp:extent cx="7290760" cy="5448300"/>
             <wp:effectExtent b="0" l="0" r="0" t="0"/>
-            <wp:docPr id="24" name="image7.png"/>
+            <wp:docPr id="24" name="image6.png"/>
             <a:graphic>
               <a:graphicData uri="http://schemas.openxmlformats.org/drawingml/2006/picture">
                 <pic:pic>
                   <pic:nvPicPr>
-                    <pic:cNvPr id="0" name="image7.png"/>
+                    <pic:cNvPr id="0" name="image6.png"/>
                     <pic:cNvPicPr preferRelativeResize="0"/>
                   </pic:nvPicPr>
                   <pic:blipFill>
@@ -17399,12 +17823,12 @@
           <wp:inline distB="114300" distT="114300" distL="114300" distR="114300">
             <wp:extent cx="5235258" cy="2689485"/>
             <wp:effectExtent b="0" l="0" r="0" t="0"/>
-            <wp:docPr id="15" name="image13.png"/>
+            <wp:docPr id="15" name="image1.png"/>
             <a:graphic>
               <a:graphicData uri="http://schemas.openxmlformats.org/drawingml/2006/picture">
                 <pic:pic>
                   <pic:nvPicPr>
-                    <pic:cNvPr id="0" name="image13.png"/>
+                    <pic:cNvPr id="0" name="image1.png"/>
                     <pic:cNvPicPr preferRelativeResize="0"/>
                   </pic:nvPicPr>
                   <pic:blipFill>
@@ -17478,12 +17902,12 @@
           <wp:inline distB="114300" distT="114300" distL="114300" distR="114300">
             <wp:extent cx="5213967" cy="2671732"/>
             <wp:effectExtent b="0" l="0" r="0" t="0"/>
-            <wp:docPr id="35" name="image28.png"/>
+            <wp:docPr id="35" name="image21.png"/>
             <a:graphic>
               <a:graphicData uri="http://schemas.openxmlformats.org/drawingml/2006/picture">
                 <pic:pic>
                   <pic:nvPicPr>
-                    <pic:cNvPr id="0" name="image28.png"/>
+                    <pic:cNvPr id="0" name="image21.png"/>
                     <pic:cNvPicPr preferRelativeResize="0"/>
                   </pic:nvPicPr>
                   <pic:blipFill>
@@ -17676,12 +18100,12 @@
           <wp:inline distB="114300" distT="114300" distL="114300" distR="114300">
             <wp:extent cx="4892358" cy="2487748"/>
             <wp:effectExtent b="0" l="0" r="0" t="0"/>
-            <wp:docPr id="14" name="image4.png"/>
+            <wp:docPr id="14" name="image10.png"/>
             <a:graphic>
               <a:graphicData uri="http://schemas.openxmlformats.org/drawingml/2006/picture">
                 <pic:pic>
                   <pic:nvPicPr>
-                    <pic:cNvPr id="0" name="image4.png"/>
+                    <pic:cNvPr id="0" name="image10.png"/>
                     <pic:cNvPicPr preferRelativeResize="0"/>
                   </pic:nvPicPr>
                   <pic:blipFill>
@@ -17755,12 +18179,12 @@
           <wp:inline distB="114300" distT="114300" distL="114300" distR="114300">
             <wp:extent cx="4885771" cy="2478012"/>
             <wp:effectExtent b="0" l="0" r="0" t="0"/>
-            <wp:docPr id="10" name="image2.png"/>
+            <wp:docPr id="10" name="image14.png"/>
             <a:graphic>
               <a:graphicData uri="http://schemas.openxmlformats.org/drawingml/2006/picture">
                 <pic:pic>
                   <pic:nvPicPr>
-                    <pic:cNvPr id="0" name="image2.png"/>
+                    <pic:cNvPr id="0" name="image14.png"/>
                     <pic:cNvPicPr preferRelativeResize="0"/>
                   </pic:nvPicPr>
                   <pic:blipFill>
@@ -18038,12 +18462,12 @@
           <wp:inline distB="114300" distT="114300" distL="114300" distR="114300">
             <wp:extent cx="4854258" cy="2465791"/>
             <wp:effectExtent b="0" l="0" r="0" t="0"/>
-            <wp:docPr id="21" name="image5.png"/>
+            <wp:docPr id="21" name="image9.png"/>
             <a:graphic>
               <a:graphicData uri="http://schemas.openxmlformats.org/drawingml/2006/picture">
                 <pic:pic>
                   <pic:nvPicPr>
-                    <pic:cNvPr id="0" name="image5.png"/>
+                    <pic:cNvPr id="0" name="image9.png"/>
                     <pic:cNvPicPr preferRelativeResize="0"/>
                   </pic:nvPicPr>
                   <pic:blipFill>
@@ -18117,12 +18541,12 @@
           <wp:inline distB="114300" distT="114300" distL="114300" distR="114300">
             <wp:extent cx="4930458" cy="2494231"/>
             <wp:effectExtent b="0" l="0" r="0" t="0"/>
-            <wp:docPr id="19" name="image3.png"/>
+            <wp:docPr id="19" name="image7.png"/>
             <a:graphic>
               <a:graphicData uri="http://schemas.openxmlformats.org/drawingml/2006/picture">
                 <pic:pic>
                   <pic:nvPicPr>
-                    <pic:cNvPr id="0" name="image3.png"/>
+                    <pic:cNvPr id="0" name="image7.png"/>
                     <pic:cNvPicPr preferRelativeResize="0"/>
                   </pic:nvPicPr>
                   <pic:blipFill>
@@ -18196,12 +18620,12 @@
           <wp:inline distB="114300" distT="114300" distL="114300" distR="114300">
             <wp:extent cx="5018464" cy="2568847"/>
             <wp:effectExtent b="0" l="0" r="0" t="0"/>
-            <wp:docPr id="31" name="image24.png"/>
+            <wp:docPr id="31" name="image20.png"/>
             <a:graphic>
               <a:graphicData uri="http://schemas.openxmlformats.org/drawingml/2006/picture">
                 <pic:pic>
                   <pic:nvPicPr>
-                    <pic:cNvPr id="0" name="image24.png"/>
+                    <pic:cNvPr id="0" name="image20.png"/>
                     <pic:cNvPicPr preferRelativeResize="0"/>
                   </pic:nvPicPr>
                   <pic:blipFill>
@@ -18275,12 +18699,12 @@
           <wp:inline distB="114300" distT="114300" distL="114300" distR="114300">
             <wp:extent cx="4930458" cy="2545792"/>
             <wp:effectExtent b="0" l="0" r="0" t="0"/>
-            <wp:docPr id="30" name="image27.png"/>
+            <wp:docPr id="30" name="image18.png"/>
             <a:graphic>
               <a:graphicData uri="http://schemas.openxmlformats.org/drawingml/2006/picture">
                 <pic:pic>
                   <pic:nvPicPr>
-                    <pic:cNvPr id="0" name="image27.png"/>
+                    <pic:cNvPr id="0" name="image18.png"/>
                     <pic:cNvPicPr preferRelativeResize="0"/>
                   </pic:nvPicPr>
                   <pic:blipFill>
@@ -18642,12 +19066,12 @@
           <wp:inline distB="114300" distT="114300" distL="114300" distR="114300">
             <wp:extent cx="4750267" cy="2458962"/>
             <wp:effectExtent b="0" l="0" r="0" t="0"/>
-            <wp:docPr id="27" name="image10.png"/>
+            <wp:docPr id="27" name="image22.png"/>
             <a:graphic>
               <a:graphicData uri="http://schemas.openxmlformats.org/drawingml/2006/picture">
                 <pic:pic>
                   <pic:nvPicPr>
-                    <pic:cNvPr id="0" name="image10.png"/>
+                    <pic:cNvPr id="0" name="image22.png"/>
                     <pic:cNvPicPr preferRelativeResize="0"/>
                   </pic:nvPicPr>
                   <pic:blipFill>
@@ -21072,12 +21496,12 @@
           <wp:extent cx="685799" cy="694944"/>
           <wp:effectExtent b="0" l="0" r="0" t="0"/>
           <wp:wrapNone/>
-          <wp:docPr id="23" name="image16.jpg"/>
+          <wp:docPr id="23" name="image3.jpg"/>
           <a:graphic>
             <a:graphicData uri="http://schemas.openxmlformats.org/drawingml/2006/picture">
               <pic:pic>
                 <pic:nvPicPr>
-                  <pic:cNvPr id="0" name="image16.jpg"/>
+                  <pic:cNvPr id="0" name="image3.jpg"/>
                   <pic:cNvPicPr preferRelativeResize="0"/>
                 </pic:nvPicPr>
                 <pic:blipFill>

</xml_diff>